<commit_message>
Update BWC letter template and add Basel U17/U20 letter template
- BWC Visa Invitation Letter.docx: letter date updated (15.10.2026)
- Basel U20 Visa Invitation Letter.docx: template for the Basel U17/U20 World Cup
  (08.-10.01.2027), same structure and placeholders as the BWC letter; to be
  referenced by a client in config/clients.php ('template')

Co-Authored-By: Claude Sonnet 5.5 <noreply@anthropic.com>
</commit_message>
<xml_diff>
--- a/resources/BWC Visa Invitation Letter.docx
+++ b/resources/BWC Visa Invitation Letter.docx
@@ -249,6 +249,7 @@
             <w:tcBorders>
               <w:right w:val="single" w:sz="4" w:space="0" w:color="FFFFFF" w:themeColor="background1"/>
             </w:tcBorders>
+            <w:noWrap/>
           </w:tcPr>
           <w:p>
             <w:pPr>
@@ -273,6 +274,7 @@
               <w:left w:val="single" w:sz="4" w:space="0" w:color="FFFFFF" w:themeColor="background1"/>
               <w:right w:val="single" w:sz="4" w:space="0" w:color="FFFFFF" w:themeColor="background1"/>
             </w:tcBorders>
+            <w:noWrap/>
           </w:tcPr>
           <w:p>
             <w:pPr>
@@ -298,6 +300,7 @@
               <w:left w:val="single" w:sz="4" w:space="0" w:color="FFFFFF" w:themeColor="background1"/>
               <w:right w:val="single" w:sz="4" w:space="0" w:color="FFFFFF" w:themeColor="background1"/>
             </w:tcBorders>
+            <w:noWrap/>
           </w:tcPr>
           <w:p>
             <w:pPr>
@@ -323,6 +326,7 @@
               <w:left w:val="single" w:sz="4" w:space="0" w:color="FFFFFF" w:themeColor="background1"/>
               <w:right w:val="single" w:sz="4" w:space="0" w:color="FFFFFF" w:themeColor="background1"/>
             </w:tcBorders>
+            <w:noWrap/>
           </w:tcPr>
           <w:p>
             <w:pPr>
@@ -1653,7 +1657,7 @@
           <w:sz w:val="20"/>
           <w:szCs w:val="20"/>
         </w:rPr>
-        <w:t>05.10.2026</w:t>
+        <w:t>15.10.2026</w:t>
       </w:r>
       <w:r>
         <w:rPr>
@@ -1949,15 +1953,15 @@
               <w:noProof/>
             </w:rPr>
             <w:drawing>
-              <wp:anchor distT="0" distB="0" distL="114300" distR="114300" simplePos="0" relativeHeight="251665408" behindDoc="0" locked="0" layoutInCell="1" allowOverlap="1" wp14:anchorId="7E799BEC" wp14:editId="7AF75EC3">
+              <wp:anchor distT="0" distB="0" distL="114300" distR="114300" simplePos="0" relativeHeight="251665408" behindDoc="0" locked="0" layoutInCell="1" allowOverlap="1" wp14:anchorId="7E799BEC" wp14:editId="54646F4A">
                 <wp:simplePos x="0" y="0"/>
                 <wp:positionH relativeFrom="column">
-                  <wp:posOffset>36830</wp:posOffset>
+                  <wp:posOffset>36195</wp:posOffset>
                 </wp:positionH>
-                <wp:positionV relativeFrom="paragraph">
-                  <wp:posOffset>-635</wp:posOffset>
+                <wp:positionV relativeFrom="page">
+                  <wp:align>top</wp:align>
                 </wp:positionV>
-                <wp:extent cx="711835" cy="711835"/>
+                <wp:extent cx="712800" cy="712800"/>
                 <wp:effectExtent l="0" t="0" r="0" b="0"/>
                 <wp:wrapNone/>
                 <wp:docPr id="1017985753" name="Picture 2"/>
@@ -1986,7 +1990,7 @@
                       <pic:spPr>
                         <a:xfrm>
                           <a:off x="0" y="0"/>
-                          <a:ext cx="711835" cy="711835"/>
+                          <a:ext cx="712800" cy="712800"/>
                         </a:xfrm>
                         <a:prstGeom prst="rect">
                           <a:avLst/>
@@ -7914,31 +7918,10 @@
 </file>
 
 <file path=customXml/item2.xml><?xml version="1.0" encoding="utf-8"?>
-<p:properties xmlns:p="http://schemas.microsoft.com/office/2006/metadata/properties" xmlns:xsi="http://www.w3.org/2001/XMLSchema-instance" xmlns:pc="http://schemas.microsoft.com/office/infopath/2007/PartnerControls">
-  <documentManagement>
-    <TaxCatchAll xmlns="873e6ddb-01a2-4494-88d8-2df4759f7b7a" xsi:nil="true"/>
-    <lcf76f155ced4ddcb4097134ff3c332f xmlns="e809389a-a247-437e-8474-aa6fd3c37986">
-      <Terms xmlns="http://schemas.microsoft.com/office/infopath/2007/PartnerControls"/>
-    </lcf76f155ced4ddcb4097134ff3c332f>
-    <Datum xmlns="e809389a-a247-437e-8474-aa6fd3c37986" xsi:nil="true"/>
-  </documentManagement>
-</p:properties>
+<b:Sources xmlns:b="http://schemas.openxmlformats.org/officeDocument/2006/bibliography" xmlns="http://schemas.openxmlformats.org/officeDocument/2006/bibliography" SelectedStyle="/APASixthEditionOfficeOnline.xsl" StyleName="APA" Version="6"/>
 </file>
 
 <file path=customXml/item3.xml><?xml version="1.0" encoding="utf-8"?>
-<?mso-contentType ?>
-<FormTemplates xmlns="http://schemas.microsoft.com/sharepoint/v3/contenttype/forms">
-  <Display>DocumentLibraryForm</Display>
-  <Edit>DocumentLibraryForm</Edit>
-  <New>DocumentLibraryForm</New>
-</FormTemplates>
-</file>
-
-<file path=customXml/item4.xml><?xml version="1.0" encoding="utf-8"?>
-<b:Sources xmlns:b="http://schemas.openxmlformats.org/officeDocument/2006/bibliography" xmlns="http://schemas.openxmlformats.org/officeDocument/2006/bibliography" SelectedStyle="/APASixthEditionOfficeOnline.xsl" StyleName="APA" Version="6"/>
-</file>
-
-<file path=customXml/item5.xml><?xml version="1.0" encoding="utf-8"?>
 <ct:contentTypeSchema xmlns:ct="http://schemas.microsoft.com/office/2006/metadata/contentType" xmlns:ma="http://schemas.microsoft.com/office/2006/metadata/properties/metaAttributes" ct:_="" ma:_="" ma:contentTypeName="Document" ma:contentTypeID="0x010100458979B255084946A0433CA68756C1FD" ma:contentTypeVersion="16" ma:contentTypeDescription="Create a new document." ma:contentTypeScope="" ma:versionID="734b0cfa486ccc16da3d0a3493576ef4">
   <xsd:schema xmlns:xsd="http://www.w3.org/2001/XMLSchema" xmlns:xs="http://www.w3.org/2001/XMLSchema" xmlns:p="http://schemas.microsoft.com/office/2006/metadata/properties" xmlns:ns2="873e6ddb-01a2-4494-88d8-2df4759f7b7a" xmlns:ns3="e809389a-a247-437e-8474-aa6fd3c37986" targetNamespace="http://schemas.microsoft.com/office/2006/metadata/properties" ma:root="true" ma:fieldsID="dcf8b273acf1672cc26c3a8b58c44e5d" ns2:_="" ns3:_="">
     <xsd:import namespace="873e6ddb-01a2-4494-88d8-2df4759f7b7a"/>
@@ -8179,6 +8162,27 @@
 </ct:contentTypeSchema>
 </file>
 
+<file path=customXml/item4.xml><?xml version="1.0" encoding="utf-8"?>
+<p:properties xmlns:p="http://schemas.microsoft.com/office/2006/metadata/properties" xmlns:xsi="http://www.w3.org/2001/XMLSchema-instance" xmlns:pc="http://schemas.microsoft.com/office/infopath/2007/PartnerControls">
+  <documentManagement>
+    <TaxCatchAll xmlns="873e6ddb-01a2-4494-88d8-2df4759f7b7a" xsi:nil="true"/>
+    <lcf76f155ced4ddcb4097134ff3c332f xmlns="e809389a-a247-437e-8474-aa6fd3c37986">
+      <Terms xmlns="http://schemas.microsoft.com/office/infopath/2007/PartnerControls"/>
+    </lcf76f155ced4ddcb4097134ff3c332f>
+    <Datum xmlns="e809389a-a247-437e-8474-aa6fd3c37986" xsi:nil="true"/>
+  </documentManagement>
+</p:properties>
+</file>
+
+<file path=customXml/item5.xml><?xml version="1.0" encoding="utf-8"?>
+<?mso-contentType ?>
+<FormTemplates xmlns="http://schemas.microsoft.com/sharepoint/v3/contenttype/forms">
+  <Display>DocumentLibraryForm</Display>
+  <Edit>DocumentLibraryForm</Edit>
+  <New>DocumentLibraryForm</New>
+</FormTemplates>
+</file>
+
 <file path=customXml/itemProps1.xml><?xml version="1.0" encoding="utf-8"?>
 <ds:datastoreItem xmlns:ds="http://schemas.openxmlformats.org/officeDocument/2006/customXml" ds:itemID="{55AF091B-3C7A-41E3-B477-F2FDAA23CFDA}">
   <ds:schemaRefs>
@@ -8188,25 +8192,6 @@
 </file>
 
 <file path=customXml/itemProps2.xml><?xml version="1.0" encoding="utf-8"?>
-<ds:datastoreItem xmlns:ds="http://schemas.openxmlformats.org/officeDocument/2006/customXml" ds:itemID="{7D114EB0-7824-4FE0-9765-8D55C03B6B5D}">
-  <ds:schemaRefs>
-    <ds:schemaRef ds:uri="http://schemas.microsoft.com/office/2006/metadata/properties"/>
-    <ds:schemaRef ds:uri="http://schemas.microsoft.com/office/infopath/2007/PartnerControls"/>
-    <ds:schemaRef ds:uri="873e6ddb-01a2-4494-88d8-2df4759f7b7a"/>
-    <ds:schemaRef ds:uri="e809389a-a247-437e-8474-aa6fd3c37986"/>
-  </ds:schemaRefs>
-</ds:datastoreItem>
-</file>
-
-<file path=customXml/itemProps3.xml><?xml version="1.0" encoding="utf-8"?>
-<ds:datastoreItem xmlns:ds="http://schemas.openxmlformats.org/officeDocument/2006/customXml" ds:itemID="{1A6C721B-8C01-463B-86E0-23D78AEEBD06}">
-  <ds:schemaRefs>
-    <ds:schemaRef ds:uri="http://schemas.microsoft.com/sharepoint/v3/contenttype/forms"/>
-  </ds:schemaRefs>
-</ds:datastoreItem>
-</file>
-
-<file path=customXml/itemProps4.xml><?xml version="1.0" encoding="utf-8"?>
 <ds:datastoreItem xmlns:ds="http://schemas.openxmlformats.org/officeDocument/2006/customXml" ds:itemID="{BA97D995-2328-B14B-97CF-26E8FDB34DC8}">
   <ds:schemaRefs>
     <ds:schemaRef ds:uri="http://schemas.openxmlformats.org/officeDocument/2006/bibliography"/>
@@ -8214,7 +8199,7 @@
 </ds:datastoreItem>
 </file>
 
-<file path=customXml/itemProps5.xml><?xml version="1.0" encoding="utf-8"?>
+<file path=customXml/itemProps3.xml><?xml version="1.0" encoding="utf-8"?>
 <ds:datastoreItem xmlns:ds="http://schemas.openxmlformats.org/officeDocument/2006/customXml" ds:itemID="{FB6D4D7A-47C7-4902-A7F2-11CFD7B2E403}">
   <ds:schemaRefs>
     <ds:schemaRef ds:uri="http://schemas.microsoft.com/office/2006/metadata/contentType"/>
@@ -8231,4 +8216,23 @@
     <ds:schemaRef ds:uri="http://schemas.microsoft.com/internal/obd"/>
   </ds:schemaRefs>
 </ds:datastoreItem>
+</file>
+
+<file path=customXml/itemProps4.xml><?xml version="1.0" encoding="utf-8"?>
+<ds:datastoreItem xmlns:ds="http://schemas.openxmlformats.org/officeDocument/2006/customXml" ds:itemID="{7D114EB0-7824-4FE0-9765-8D55C03B6B5D}">
+  <ds:schemaRefs>
+    <ds:schemaRef ds:uri="http://schemas.microsoft.com/office/2006/metadata/properties"/>
+    <ds:schemaRef ds:uri="http://schemas.microsoft.com/office/infopath/2007/PartnerControls"/>
+    <ds:schemaRef ds:uri="873e6ddb-01a2-4494-88d8-2df4759f7b7a"/>
+    <ds:schemaRef ds:uri="e809389a-a247-437e-8474-aa6fd3c37986"/>
+  </ds:schemaRefs>
+</ds:datastoreItem>
+</file>
+
+<file path=customXml/itemProps5.xml><?xml version="1.0" encoding="utf-8"?>
+<ds:datastoreItem xmlns:ds="http://schemas.openxmlformats.org/officeDocument/2006/customXml" ds:itemID="{1A6C721B-8C01-463B-86E0-23D78AEEBD06}">
+  <ds:schemaRefs>
+    <ds:schemaRef ds:uri="http://schemas.microsoft.com/sharepoint/v3/contenttype/forms"/>
+  </ds:schemaRefs>
+</ds:datastoreItem>
 </file>
</xml_diff>